<commit_message>
Fill Spotify/Apple links in October draft; query Apple's GB storefront
Co-Authored-By: Claude Opus 5.5 <noreply@anthropic.com>
</commit_message>
<xml_diff>
--- a/automation/TGT October 2026 - blog and newsletter copy.docx
+++ b/automation/TGT October 2026 - blog and newsletter copy.docx
@@ -224,8 +224,31 @@
         <w:pStyle w:val="Compact"/>
       </w:pPr>
       <w:r>
-        <w:t>Listen on [Spotify — link TBD] or [Apple Podcasts — link TBD]</w:t>
-      </w:r>
+        <w:t xml:space="preserve">Listen on </w:t>
+      </w:r>
+      <w:hyperlink r:id="rId9">
+        <w:r>
+          <w:rPr>
+            <w:rStyle w:val="Hyperlink"/>
+            <w:u w:val="single"/>
+            <w:color w:val="0563C1"/>
+          </w:rPr>
+          <w:t>Spotify</w:t>
+        </w:r>
+      </w:hyperlink>
+      <w:r>
+        <w:t xml:space="preserve"> or </w:t>
+      </w:r>
+      <w:hyperlink r:id="rId12">
+        <w:r>
+          <w:rPr>
+            <w:rStyle w:val="Hyperlink"/>
+            <w:u w:val="single"/>
+            <w:color w:val="0563C1"/>
+          </w:rPr>
+          <w:t>Apple Podcasts</w:t>
+        </w:r>
+      </w:hyperlink>
     </w:p>
     <w:p>
       <w:pPr>

</xml_diff>